<commit_message>
docs: translate literature titles
Co-authored-by: 36613453226Wallen <36613453226Wallen@users.noreply.github.com>
</commit_message>
<xml_diff>
--- a/files/附加小问题.docx
+++ b/files/附加小问题.docx
@@ -296,6 +296,8 @@
       </w:pPr>
       <w:r>
         <w:t>Ebbinghaus, H. (1885/1913). Memory: A Contribution to Experimental Psychology. 发起并量化学习—遗忘研究，采用节省法。</w:t>
+        <w:br/>
+        <w:t>标题翻译：《记忆：对实验心理学的一项贡献》；作者：Ebbinghaus, H.</w:t>
       </w:r>
     </w:p>
     <w:p>
@@ -304,6 +306,8 @@
       </w:pPr>
       <w:r>
         <w:t>Murre, J. M. J., &amp; Dros, J. (2015). Replication and Analysis of Ebbinghaus’ Forgetting Curve. PLOS ONE, 10(7), e0120644. https://doi.org/10.1371/journal.pone.0120644</w:t>
+        <w:br/>
+        <w:t>标题翻译：《艾宾浩斯遗忘曲线的重复验证与分析》；作者：Murre, J. M. J., &amp; Dros, J.</w:t>
       </w:r>
     </w:p>
     <w:p>
@@ -312,6 +316,8 @@
       </w:pPr>
       <w:r>
         <w:t>Cowan, N. (2001). The Magical Number 4 in Short-Term Memory. Behavioral and Brain Sciences, 24(1), 87–114. https://doi.org/10.1017/S0140525X01003922</w:t>
+        <w:br/>
+        <w:t>标题翻译：《短时记忆中的神奇数字4：重新审视心理存储容量》；作者：Cowan, N.</w:t>
       </w:r>
     </w:p>
     <w:p>
@@ -320,6 +326,8 @@
       </w:pPr>
       <w:r>
         <w:t>Kintsch, W. (1988). The Role of Knowledge in Discourse Comprehension: A Construction-Integration Model. Psychological Review, 95(2), 163–182. https://doi.org/10.1037/0033-295X.95.2.163</w:t>
+        <w:br/>
+        <w:t>标题翻译：《知识在篇章理解中的作用：建构—整合模型》；作者：Kintsch, W.</w:t>
       </w:r>
     </w:p>
     <w:p>
@@ -328,6 +336,8 @@
       </w:pPr>
       <w:r>
         <w:t>Lorch, R. F., Jr., &amp; Lorch, E. P. (1995). Effects of Organizational Signals on Text-Processing Strategies. Journal of Educational Psychology, 87(4), 537–544. https://doi.org/10.1037/0022-0663.87.4.537</w:t>
+        <w:br/>
+        <w:t>标题翻译：《组织信号对文本加工策略的影响》；作者：Lorch, R. F., Jr., &amp; Lorch, E. P.</w:t>
       </w:r>
     </w:p>
     <w:p>
@@ -336,6 +346,8 @@
       </w:pPr>
       <w:r>
         <w:t>Alhola, P., &amp; Polo-Kantola, P. (2007). Sleep Deprivation: Impact on Cognitive Performance. Neuropsychiatric Disease and Treatment, 3(5), 553–567. https://pmc.ncbi.nlm.nih.gov/articles/PMC2656292/</w:t>
+        <w:br/>
+        <w:t>标题翻译：《睡眠剥夺：对认知表现的影响》；作者：Alhola, P., &amp; Polo-Kantola, P.</w:t>
       </w:r>
     </w:p>
     <w:p>

</xml_diff>

<commit_message>
docs: translate literature titles (#2)
Co-authored-by: Cursor Agent <cursoragent@cursor.com>
Co-authored-by: 36613453226Wallen <36613453226Wallen@users.noreply.github.com>
</commit_message>
<xml_diff>
--- a/files/附加小问题.docx
+++ b/files/附加小问题.docx
@@ -296,6 +296,8 @@
       </w:pPr>
       <w:r>
         <w:t>Ebbinghaus, H. (1885/1913). Memory: A Contribution to Experimental Psychology. 发起并量化学习—遗忘研究，采用节省法。</w:t>
+        <w:br/>
+        <w:t>标题翻译：《记忆：对实验心理学的一项贡献》；作者：Ebbinghaus, H.</w:t>
       </w:r>
     </w:p>
     <w:p>
@@ -304,6 +306,8 @@
       </w:pPr>
       <w:r>
         <w:t>Murre, J. M. J., &amp; Dros, J. (2015). Replication and Analysis of Ebbinghaus’ Forgetting Curve. PLOS ONE, 10(7), e0120644. https://doi.org/10.1371/journal.pone.0120644</w:t>
+        <w:br/>
+        <w:t>标题翻译：《艾宾浩斯遗忘曲线的重复验证与分析》；作者：Murre, J. M. J., &amp; Dros, J.</w:t>
       </w:r>
     </w:p>
     <w:p>
@@ -312,6 +316,8 @@
       </w:pPr>
       <w:r>
         <w:t>Cowan, N. (2001). The Magical Number 4 in Short-Term Memory. Behavioral and Brain Sciences, 24(1), 87–114. https://doi.org/10.1017/S0140525X01003922</w:t>
+        <w:br/>
+        <w:t>标题翻译：《短时记忆中的神奇数字4：重新审视心理存储容量》；作者：Cowan, N.</w:t>
       </w:r>
     </w:p>
     <w:p>
@@ -320,6 +326,8 @@
       </w:pPr>
       <w:r>
         <w:t>Kintsch, W. (1988). The Role of Knowledge in Discourse Comprehension: A Construction-Integration Model. Psychological Review, 95(2), 163–182. https://doi.org/10.1037/0033-295X.95.2.163</w:t>
+        <w:br/>
+        <w:t>标题翻译：《知识在篇章理解中的作用：建构—整合模型》；作者：Kintsch, W.</w:t>
       </w:r>
     </w:p>
     <w:p>
@@ -328,6 +336,8 @@
       </w:pPr>
       <w:r>
         <w:t>Lorch, R. F., Jr., &amp; Lorch, E. P. (1995). Effects of Organizational Signals on Text-Processing Strategies. Journal of Educational Psychology, 87(4), 537–544. https://doi.org/10.1037/0022-0663.87.4.537</w:t>
+        <w:br/>
+        <w:t>标题翻译：《组织信号对文本加工策略的影响》；作者：Lorch, R. F., Jr., &amp; Lorch, E. P.</w:t>
       </w:r>
     </w:p>
     <w:p>
@@ -336,6 +346,8 @@
       </w:pPr>
       <w:r>
         <w:t>Alhola, P., &amp; Polo-Kantola, P. (2007). Sleep Deprivation: Impact on Cognitive Performance. Neuropsychiatric Disease and Treatment, 3(5), 553–567. https://pmc.ncbi.nlm.nih.gov/articles/PMC2656292/</w:t>
+        <w:br/>
+        <w:t>标题翻译：《睡眠剥夺：对认知表现的影响》；作者：Alhola, P., &amp; Polo-Kantola, P.</w:t>
       </w:r>
     </w:p>
     <w:p>

</xml_diff>